<commit_message>
Make the process independent of the WordPress build target
The client can choose a page builder at kickoff. Nothing in the process
depends on that choice, so the deck and handoffs no longer state the
build target as a settled "no page builder" decision.

Deck:
- Phase 6 card: "Build target agreed at kickoff. The process is the same
  either way."
- Phase 6 speaker note: build target is a kickoff decision, not a
  process constraint.
- Slide 17 reframed from "What the client doesn't pay for" to "The
  process holds up whatever we build it in" - the licence claim is gone,
  replaced by three independence points plus a build-target callout.
- Checklist: "Agree the build target at kickoff" instead of
  "no builder".

Handoffs:
- PM plan 4.2: the build target is the client's choice at kickoff; our
  default recommendation stands but a builder costs the client nothing
  in process, design quality or editability.
- Implementation plan 15: same framing.
</commit_message>
<xml_diff>
--- a/handoff/gerotech-handoff-plan.docx
+++ b/handoff/gerotech-handoff-plan.docx
@@ -756,14 +756,14 @@
           <w:b/>
           <w:i w:val="0"/>
         </w:rPr>
-        <w:t>The process does not change if a builder is required — only the conversion target does.</w:t>
+        <w:t>The build target is the client's choice, agreed at kickoff — and the process is independent of it.</w:t>
       </w:r>
       <w:r>
         <w:rPr>
           <w:b w:val="0"/>
           <w:i w:val="0"/>
         </w:rPr>
-        <w:t xml:space="preserve"> Everything up to conversion is identical: the prototype and the Figma file both hold the final pages, images and content, and both remain the QA references. The header and footer stay theme-level in every case; a builder only ever governs page content.</w:t>
+        <w:t xml:space="preserve"> Everything up to conversion is identical whichever target is picked: the prototype and the Figma file both hold the final pages, images and content, and both remain the QA references. The header and footer stay theme-level in every case; a builder only ever governs page content.</w:t>
       </w:r>
     </w:p>
     <w:tbl>
@@ -1328,14 +1328,30 @@
           <w:b/>
           <w:i w:val="0"/>
         </w:rPr>
-        <w:t>Recommendation: the native WordPress editor plus ACF fields — no page builder.</w:t>
+        <w:t>Our default recommendation is the native WordPress editor plus ACF fields.</w:t>
       </w:r>
       <w:r>
         <w:rPr>
           <w:b w:val="0"/>
           <w:i w:val="0"/>
         </w:rPr>
-        <w:t xml:space="preserve"> It is the only option where the prototype’s design system survives intact, the client gets structured editing fields in plain language, and there is no shortcode lock-in on a site we will maintain for years.</w:t>
+        <w:t xml:space="preserve"> It is the option where the prototype’s design system survives intact, the client gets structured editing fields in plain language, and there is no shortcode lock-in on a site we will maintain for years.</w:t>
+      </w:r>
+    </w:p>
+    <w:p>
+      <w:r>
+        <w:rPr>
+          <w:b/>
+          <w:i w:val="0"/>
+        </w:rPr>
+        <w:t>But this is the client’s decision, made at kickoff.</w:t>
+      </w:r>
+      <w:r>
+        <w:rPr>
+          <w:b w:val="0"/>
+          <w:i w:val="0"/>
+        </w:rPr>
+        <w:t xml:space="preserve"> If they prefer a familiar visual builder, they can have one — and nothing earlier in this process changes: the design system still governs, the structured fields still carry the content, and the prototype is still the QA reference. The trade-offs below are about cost and long-term maintenance, not about whether the process works.</w:t>
       </w:r>
     </w:p>
     <w:p>

</xml_diff>